<commit_message>
fix(jintan-weekly-report): align config, docs, engine and validators
- Update DEPLOYMENT.md to reflect existing v9 engine and validators
- Make generate-milestone-image.py read config.yaml instead of hardcoding
- Bump milestone image font sizes to >=28px in config.yaml
- Fix report_engine_v9.py console print keys and duplicate heading
- Unify clean_notes week range to Mon-Sun
- Show progress% in next_week plans and sanitize 进展中
- Fix eastAsia font for 暂无 placeholders
- Update validate_report_tone risk regex and quantification rules
- Simplify empty-task placeholder check in validate_weekly_report
- Refresh data and regenerate weekly report; both QA checks PASS

Co-Authored-By: Claude Opus 4.8 <noreply@anthropic.com>
</commit_message>
<xml_diff>
--- a/jintan-weekly-report-sop/output/常州市金坛第一人民医院数据指挥中心二期项目-工作周报-20260622-0626.docx
+++ b/jintan-weekly-report-sop/output/常州市金坛第一人民医院数据指挥中心二期项目-工作周报-20260622-0626.docx
@@ -445,17 +445,9 @@
               </w:rPr>
             </w:pPr>
             <w:r>
-              <w:rPr>
-                <w:rFonts w:ascii="微软雅黑" w:hAnsi="微软雅黑" w:eastAsia="微软雅黑"/>
-                <w:b/>
-                <w:sz w:val="24"/>
-              </w:rPr>
-              <w:t>一、项目总体进度</w:t>
-            </w:r>
-            <w:r>
               <w:drawing>
                 <wp:inline xmlns:a="http://schemas.openxmlformats.org/drawingml/2006/main" xmlns:pic="http://schemas.openxmlformats.org/drawingml/2006/picture">
-                  <wp:extent cx="5943600" cy="7838122"/>
+                  <wp:extent cx="5943600" cy="7118888"/>
                   <wp:docPr id="1" name="Picture 1"/>
                   <wp:cNvGraphicFramePr>
                     <a:graphicFrameLocks noChangeAspect="1"/>
@@ -476,7 +468,7 @@
                         <pic:spPr>
                           <a:xfrm>
                             <a:off x="0" y="0"/>
-                            <a:ext cx="5943600" cy="7838122"/>
+                            <a:ext cx="5943600" cy="7118888"/>
                           </a:xfrm>
                           <a:prstGeom prst="rect"/>
                         </pic:spPr>
@@ -723,6 +715,113 @@
                 <w:b/>
                 <w:sz w:val="21"/>
               </w:rPr>
+              <w:t>1. 数据应用规划设计</w:t>
+            </w:r>
+          </w:p>
+          <w:p>
+            <w:pPr>
+              <w:spacing w:before="40" w:after="40" w:line="276" w:lineRule="auto"/>
+              <w:ind w:left="567"/>
+            </w:pPr>
+            <w:r>
+              <w:rPr>
+                <w:rFonts w:ascii="微软雅黑" w:hAnsi="微软雅黑" w:eastAsia="微软雅黑"/>
+                <w:sz w:val="21"/>
+              </w:rPr>
+              <w:t>1) 高保真设计：已经根据分院反馈意见和总院沟通，完善最终的指标清单 99%</w:t>
+            </w:r>
+          </w:p>
+          <w:p>
+            <w:pPr>
+              <w:spacing w:before="40" w:after="40" w:line="276" w:lineRule="auto"/>
+              <w:ind w:left="567"/>
+            </w:pPr>
+            <w:r>
+              <w:rPr>
+                <w:rFonts w:ascii="微软雅黑" w:hAnsi="微软雅黑" w:eastAsia="微软雅黑"/>
+                <w:sz w:val="21"/>
+              </w:rPr>
+              <w:t>2) 高保真评审：需要确认评审的形式及要求 90%</w:t>
+            </w:r>
+          </w:p>
+          <w:p>
+            <w:pPr>
+              <w:spacing w:before="40" w:after="40" w:line="276" w:lineRule="auto"/>
+              <w:ind w:left="283"/>
+            </w:pPr>
+            <w:r>
+              <w:rPr>
+                <w:rFonts w:ascii="微软雅黑" w:hAnsi="微软雅黑" w:eastAsia="微软雅黑"/>
+                <w:b/>
+                <w:sz w:val="21"/>
+              </w:rPr>
+              <w:t>2. 数据清洗转换</w:t>
+            </w:r>
+          </w:p>
+          <w:p>
+            <w:pPr>
+              <w:spacing w:before="40" w:after="40" w:line="276" w:lineRule="auto"/>
+              <w:ind w:left="567"/>
+            </w:pPr>
+            <w:r>
+              <w:rPr>
+                <w:rFonts w:ascii="微软雅黑" w:hAnsi="微软雅黑" w:eastAsia="微软雅黑"/>
+                <w:sz w:val="21"/>
+              </w:rPr>
+              <w:t>1) ODS-DWD-DWS-DM：0611 李江已和卫宁方一期推进 1%</w:t>
+            </w:r>
+          </w:p>
+          <w:p>
+            <w:pPr>
+              <w:spacing w:before="40" w:after="40" w:line="276" w:lineRule="auto"/>
+              <w:ind w:left="283"/>
+            </w:pPr>
+            <w:r>
+              <w:rPr>
+                <w:rFonts w:ascii="微软雅黑" w:hAnsi="微软雅黑" w:eastAsia="微软雅黑"/>
+                <w:b/>
+                <w:sz w:val="21"/>
+              </w:rPr>
+              <w:t>3. 数据应用开发</w:t>
+            </w:r>
+          </w:p>
+          <w:p>
+            <w:pPr>
+              <w:spacing w:before="40" w:after="40" w:line="276" w:lineRule="auto"/>
+              <w:ind w:left="567"/>
+            </w:pPr>
+            <w:r>
+              <w:rPr>
+                <w:rFonts w:ascii="微软雅黑" w:hAnsi="微软雅黑" w:eastAsia="微软雅黑"/>
+                <w:sz w:val="21"/>
+              </w:rPr>
+              <w:t>1) Smartbi前端可视化大屏与地图组件开发：smartbi已经利用测试数据开发了页面，目前稳序尚未完成 30%</w:t>
+            </w:r>
+          </w:p>
+          <w:p>
+            <w:pPr>
+              <w:spacing w:before="120" w:after="40" w:line="276" w:lineRule="auto"/>
+            </w:pPr>
+            <w:r>
+              <w:rPr>
+                <w:rFonts w:ascii="微软雅黑" w:hAnsi="微软雅黑" w:eastAsia="微软雅黑"/>
+                <w:b/>
+                <w:sz w:val="22"/>
+              </w:rPr>
+              <w:t>二、病组全景分析</w:t>
+            </w:r>
+          </w:p>
+          <w:p>
+            <w:pPr>
+              <w:spacing w:before="40" w:after="40" w:line="276" w:lineRule="auto"/>
+              <w:ind w:left="283"/>
+            </w:pPr>
+            <w:r>
+              <w:rPr>
+                <w:rFonts w:ascii="微软雅黑" w:hAnsi="微软雅黑" w:eastAsia="微软雅黑"/>
+                <w:b/>
+                <w:sz w:val="21"/>
+              </w:rPr>
               <w:t>1. 调研与需求分析</w:t>
             </w:r>
           </w:p>
@@ -736,7 +835,20 @@
                 <w:rFonts w:ascii="微软雅黑" w:hAnsi="微软雅黑" w:eastAsia="微软雅黑"/>
                 <w:sz w:val="21"/>
               </w:rPr>
-              <w:t>1) 梳理并确认：已发送李江、卫宁（是否能获取指标数据），需要进一步确认并签字 95%</w:t>
+              <w:t>1) 临床科室业务流程调研：针对消化内科、心内科梳理仿真数据供调研使用 100%</w:t>
+            </w:r>
+          </w:p>
+          <w:p>
+            <w:pPr>
+              <w:spacing w:before="40" w:after="40" w:line="276" w:lineRule="auto"/>
+              <w:ind w:left="567"/>
+            </w:pPr>
+            <w:r>
+              <w:rPr>
+                <w:rFonts w:ascii="微软雅黑" w:hAnsi="微软雅黑" w:eastAsia="微软雅黑"/>
+                <w:sz w:val="21"/>
+              </w:rPr>
+              <w:t>2) 梳理并确认：和消化内科确认原型 100%</w:t>
             </w:r>
           </w:p>
           <w:p>
@@ -763,7 +875,20 @@
                 <w:rFonts w:ascii="微软雅黑" w:hAnsi="微软雅黑" w:eastAsia="微软雅黑"/>
                 <w:sz w:val="21"/>
               </w:rPr>
-              <w:t>1) 高保真评审：需要确认评审的形式及要求 90%</w:t>
+              <w:t>1) 原型图内部定稿：21号出一版，内部讨论 100%</w:t>
+            </w:r>
+          </w:p>
+          <w:p>
+            <w:pPr>
+              <w:spacing w:before="40" w:after="40" w:line="276" w:lineRule="auto"/>
+              <w:ind w:left="567"/>
+            </w:pPr>
+            <w:r>
+              <w:rPr>
+                <w:rFonts w:ascii="微软雅黑" w:hAnsi="微软雅黑" w:eastAsia="微软雅黑"/>
+                <w:sz w:val="21"/>
+              </w:rPr>
+              <w:t>2) 原型图外部评审：美化UI后发给李江了，请他发给周科 95%</w:t>
             </w:r>
           </w:p>
           <w:p>
@@ -777,7 +902,7 @@
                 <w:b/>
                 <w:sz w:val="21"/>
               </w:rPr>
-              <w:t>3. 数据清洗转换</w:t>
+              <w:t>3. 数据开发</w:t>
             </w:r>
           </w:p>
           <w:p>
@@ -790,7 +915,7 @@
                 <w:rFonts w:ascii="微软雅黑" w:hAnsi="微软雅黑" w:eastAsia="微软雅黑"/>
                 <w:sz w:val="21"/>
               </w:rPr>
-              <w:t>1) ODS-DWD-DWS-DM：0611 李江已和卫宁方一期推进 1%</w:t>
+              <w:t>1) ODS-DWD-DWS-DM：已跟火树反馈需要取数</w:t>
             </w:r>
           </w:p>
           <w:p>
@@ -817,20 +942,7 @@
                 <w:rFonts w:ascii="微软雅黑" w:hAnsi="微软雅黑" w:eastAsia="微软雅黑"/>
                 <w:sz w:val="21"/>
               </w:rPr>
-              <w:t>1) Smartbi前端可视化大屏与地图组件开发：可以开始推进，发送原型材料，通知smart可以安排资源进场 8%</w:t>
-            </w:r>
-          </w:p>
-          <w:p>
-            <w:pPr>
-              <w:spacing w:before="120" w:after="40" w:line="276" w:lineRule="auto"/>
-            </w:pPr>
-            <w:r>
-              <w:rPr>
-                <w:rFonts w:ascii="微软雅黑" w:hAnsi="微软雅黑" w:eastAsia="微软雅黑"/>
-                <w:b/>
-                <w:sz w:val="22"/>
-              </w:rPr>
-              <w:t>二、病组全景分析</w:t>
+              <w:t>1) 分析看板多维度联动、下钻功能开发：0629号可通知smart开发</w:t>
             </w:r>
           </w:p>
           <w:p>
@@ -844,7 +956,7 @@
                 <w:b/>
                 <w:sz w:val="21"/>
               </w:rPr>
-              <w:t>1. 调研与需求分析</w:t>
+              <w:t>5. 测试与发布</w:t>
             </w:r>
           </w:p>
           <w:p>
@@ -857,60 +969,7 @@
                 <w:rFonts w:ascii="微软雅黑" w:hAnsi="微软雅黑" w:eastAsia="微软雅黑"/>
                 <w:sz w:val="21"/>
               </w:rPr>
-              <w:t>1) 临床科室业务流程调研：针对消化内科、心内科梳理仿真数据供调研使用 70%</w:t>
-            </w:r>
-          </w:p>
-          <w:p>
-            <w:pPr>
-              <w:spacing w:before="40" w:after="40" w:line="276" w:lineRule="auto"/>
-              <w:ind w:left="567"/>
-            </w:pPr>
-            <w:r>
-              <w:rPr>
-                <w:rFonts w:ascii="微软雅黑" w:hAnsi="微软雅黑" w:eastAsia="微软雅黑"/>
-                <w:sz w:val="21"/>
-              </w:rPr>
-              <w:t>2) 梳理并确认：和消化内科确认原型 60%</w:t>
-            </w:r>
-          </w:p>
-          <w:p>
-            <w:pPr>
-              <w:spacing w:before="40" w:after="40" w:line="276" w:lineRule="auto"/>
-              <w:ind w:left="283"/>
-            </w:pPr>
-            <w:r>
-              <w:rPr>
-                <w:rFonts w:ascii="微软雅黑" w:hAnsi="微软雅黑" w:eastAsia="微软雅黑"/>
-                <w:b/>
-                <w:sz w:val="21"/>
-              </w:rPr>
-              <w:t>2. 数据应用规划设计</w:t>
-            </w:r>
-          </w:p>
-          <w:p>
-            <w:pPr>
-              <w:spacing w:before="40" w:after="40" w:line="276" w:lineRule="auto"/>
-              <w:ind w:left="567"/>
-            </w:pPr>
-            <w:r>
-              <w:rPr>
-                <w:rFonts w:ascii="微软雅黑" w:hAnsi="微软雅黑" w:eastAsia="微软雅黑"/>
-                <w:sz w:val="21"/>
-              </w:rPr>
-              <w:t>1) 原型图内部定稿：21号出一版，内部讨论 95%</w:t>
-            </w:r>
-          </w:p>
-          <w:p>
-            <w:pPr>
-              <w:spacing w:before="40" w:after="40" w:line="276" w:lineRule="auto"/>
-              <w:ind w:left="567"/>
-            </w:pPr>
-            <w:r>
-              <w:rPr>
-                <w:rFonts w:ascii="微软雅黑" w:hAnsi="微软雅黑" w:eastAsia="微软雅黑"/>
-                <w:sz w:val="21"/>
-              </w:rPr>
-              <w:t>2) 原型图外部评审：美化UI后发给李江了，请他发给周科 80%</w:t>
+              <w:t>1) UAT测试及系统缺陷修复：（调研科室签字）</w:t>
             </w:r>
           </w:p>
           <w:p>
@@ -1062,6 +1121,113 @@
                 <w:b/>
                 <w:sz w:val="21"/>
               </w:rPr>
+              <w:t>1. 数据应用规划设计</w:t>
+            </w:r>
+          </w:p>
+          <w:p>
+            <w:pPr>
+              <w:spacing w:before="40" w:after="40" w:line="276" w:lineRule="auto"/>
+              <w:ind w:left="567"/>
+            </w:pPr>
+            <w:r>
+              <w:rPr>
+                <w:rFonts w:ascii="微软雅黑" w:hAnsi="微软雅黑" w:eastAsia="微软雅黑"/>
+                <w:sz w:val="21"/>
+              </w:rPr>
+              <w:t>1) 高保真设计：已经根据分院反馈意见和总院沟通，完善最终的指标清单（继续推进） 99%</w:t>
+            </w:r>
+          </w:p>
+          <w:p>
+            <w:pPr>
+              <w:spacing w:before="40" w:after="40" w:line="276" w:lineRule="auto"/>
+              <w:ind w:left="567"/>
+            </w:pPr>
+            <w:r>
+              <w:rPr>
+                <w:rFonts w:ascii="微软雅黑" w:hAnsi="微软雅黑" w:eastAsia="微软雅黑"/>
+                <w:sz w:val="21"/>
+              </w:rPr>
+              <w:t>2) 高保真评审：需要确认评审的形式及要求（继续推进） 90%</w:t>
+            </w:r>
+          </w:p>
+          <w:p>
+            <w:pPr>
+              <w:spacing w:before="40" w:after="40" w:line="276" w:lineRule="auto"/>
+              <w:ind w:left="283"/>
+            </w:pPr>
+            <w:r>
+              <w:rPr>
+                <w:rFonts w:ascii="微软雅黑" w:hAnsi="微软雅黑" w:eastAsia="微软雅黑"/>
+                <w:b/>
+                <w:sz w:val="21"/>
+              </w:rPr>
+              <w:t>2. 数据清洗转换</w:t>
+            </w:r>
+          </w:p>
+          <w:p>
+            <w:pPr>
+              <w:spacing w:before="40" w:after="40" w:line="276" w:lineRule="auto"/>
+              <w:ind w:left="567"/>
+            </w:pPr>
+            <w:r>
+              <w:rPr>
+                <w:rFonts w:ascii="微软雅黑" w:hAnsi="微软雅黑" w:eastAsia="微软雅黑"/>
+                <w:sz w:val="21"/>
+              </w:rPr>
+              <w:t>1) ODS-DWD-DWS-DM：0611 李江已和卫宁方一期推进（继续推进） 1%</w:t>
+            </w:r>
+          </w:p>
+          <w:p>
+            <w:pPr>
+              <w:spacing w:before="40" w:after="40" w:line="276" w:lineRule="auto"/>
+              <w:ind w:left="283"/>
+            </w:pPr>
+            <w:r>
+              <w:rPr>
+                <w:rFonts w:ascii="微软雅黑" w:hAnsi="微软雅黑" w:eastAsia="微软雅黑"/>
+                <w:b/>
+                <w:sz w:val="21"/>
+              </w:rPr>
+              <w:t>3. 数据应用开发</w:t>
+            </w:r>
+          </w:p>
+          <w:p>
+            <w:pPr>
+              <w:spacing w:before="40" w:after="40" w:line="276" w:lineRule="auto"/>
+              <w:ind w:left="567"/>
+            </w:pPr>
+            <w:r>
+              <w:rPr>
+                <w:rFonts w:ascii="微软雅黑" w:hAnsi="微软雅黑" w:eastAsia="微软雅黑"/>
+                <w:sz w:val="21"/>
+              </w:rPr>
+              <w:t>1) Smartbi前端可视化大屏与地图组件开发：smartbi已经利用测试数据开发了页面，目前稳序尚未完成（继续推进） 30%</w:t>
+            </w:r>
+          </w:p>
+          <w:p>
+            <w:pPr>
+              <w:spacing w:before="120" w:after="40" w:line="276" w:lineRule="auto"/>
+            </w:pPr>
+            <w:r>
+              <w:rPr>
+                <w:rFonts w:ascii="微软雅黑" w:hAnsi="微软雅黑" w:eastAsia="微软雅黑"/>
+                <w:b/>
+                <w:sz w:val="22"/>
+              </w:rPr>
+              <w:t>二、病组全景分析</w:t>
+            </w:r>
+          </w:p>
+          <w:p>
+            <w:pPr>
+              <w:spacing w:before="40" w:after="40" w:line="276" w:lineRule="auto"/>
+              <w:ind w:left="283"/>
+            </w:pPr>
+            <w:r>
+              <w:rPr>
+                <w:rFonts w:ascii="微软雅黑" w:hAnsi="微软雅黑" w:eastAsia="微软雅黑"/>
+                <w:b/>
+                <w:sz w:val="21"/>
+              </w:rPr>
               <w:t>1. 调研与需求分析</w:t>
             </w:r>
           </w:p>
@@ -1075,7 +1241,20 @@
                 <w:rFonts w:ascii="微软雅黑" w:hAnsi="微软雅黑" w:eastAsia="微软雅黑"/>
                 <w:sz w:val="21"/>
               </w:rPr>
-              <w:t>1) 梳理并确认：已发送李江、卫宁（是否能获取指标数据），需要进一步确认并签字（继续推进）</w:t>
+              <w:t>1) 临床科室业务流程调研：针对消化内科、心内科梳理仿真数据供调研使用（确认完成） 100%</w:t>
+            </w:r>
+          </w:p>
+          <w:p>
+            <w:pPr>
+              <w:spacing w:before="40" w:after="40" w:line="276" w:lineRule="auto"/>
+              <w:ind w:left="567"/>
+            </w:pPr>
+            <w:r>
+              <w:rPr>
+                <w:rFonts w:ascii="微软雅黑" w:hAnsi="微软雅黑" w:eastAsia="微软雅黑"/>
+                <w:sz w:val="21"/>
+              </w:rPr>
+              <w:t>2) 梳理并确认：和消化内科确认原型（确认完成） 100%</w:t>
             </w:r>
           </w:p>
           <w:p>
@@ -1102,7 +1281,20 @@
                 <w:rFonts w:ascii="微软雅黑" w:hAnsi="微软雅黑" w:eastAsia="微软雅黑"/>
                 <w:sz w:val="21"/>
               </w:rPr>
-              <w:t>1) 高保真评审：需要确认评审的形式及要求（继续推进）</w:t>
+              <w:t>1) 原型图内部定稿：21号出一版，内部讨论（确认完成） 100%</w:t>
+            </w:r>
+          </w:p>
+          <w:p>
+            <w:pPr>
+              <w:spacing w:before="40" w:after="40" w:line="276" w:lineRule="auto"/>
+              <w:ind w:left="567"/>
+            </w:pPr>
+            <w:r>
+              <w:rPr>
+                <w:rFonts w:ascii="微软雅黑" w:hAnsi="微软雅黑" w:eastAsia="微软雅黑"/>
+                <w:sz w:val="21"/>
+              </w:rPr>
+              <w:t>2) 原型图外部评审：美化UI后发给李江了，请他发给周科（继续推进） 95%</w:t>
             </w:r>
           </w:p>
           <w:p>
@@ -1116,7 +1308,7 @@
                 <w:b/>
                 <w:sz w:val="21"/>
               </w:rPr>
-              <w:t>3. 数据清洗转换</w:t>
+              <w:t>3. 数据开发</w:t>
             </w:r>
           </w:p>
           <w:p>
@@ -1129,7 +1321,7 @@
                 <w:rFonts w:ascii="微软雅黑" w:hAnsi="微软雅黑" w:eastAsia="微软雅黑"/>
                 <w:sz w:val="21"/>
               </w:rPr>
-              <w:t>1) ODS-DWD-DWS-DM：0611 李江已和卫宁方一期推进（继续推进）</w:t>
+              <w:t>1) ODS-DWD-DWS-DM：已跟火树反馈需要取数</w:t>
             </w:r>
           </w:p>
           <w:p>
@@ -1156,7 +1348,34 @@
                 <w:rFonts w:ascii="微软雅黑" w:hAnsi="微软雅黑" w:eastAsia="微软雅黑"/>
                 <w:sz w:val="21"/>
               </w:rPr>
-              <w:t>1) Smartbi前端可视化大屏与地图组件开发：可以开始推进，发送原型材料，通知smart可以安排资源进场（继续推进）</w:t>
+              <w:t>1) 分析看板多维度联动、下钻功能开发：0629号可通知smart开发</w:t>
+            </w:r>
+          </w:p>
+          <w:p>
+            <w:pPr>
+              <w:spacing w:before="40" w:after="40" w:line="276" w:lineRule="auto"/>
+              <w:ind w:left="283"/>
+            </w:pPr>
+            <w:r>
+              <w:rPr>
+                <w:rFonts w:ascii="微软雅黑" w:hAnsi="微软雅黑" w:eastAsia="微软雅黑"/>
+                <w:b/>
+                <w:sz w:val="21"/>
+              </w:rPr>
+              <w:t>5. 测试与发布</w:t>
+            </w:r>
+          </w:p>
+          <w:p>
+            <w:pPr>
+              <w:spacing w:before="40" w:after="40" w:line="276" w:lineRule="auto"/>
+              <w:ind w:left="567"/>
+            </w:pPr>
+            <w:r>
+              <w:rPr>
+                <w:rFonts w:ascii="微软雅黑" w:hAnsi="微软雅黑" w:eastAsia="微软雅黑"/>
+                <w:sz w:val="21"/>
+              </w:rPr>
+              <w:t>1) UAT测试及系统缺陷修复：（调研科室签字）</w:t>
             </w:r>
           </w:p>
           <w:p>
@@ -1169,7 +1388,7 @@
                 <w:b/>
                 <w:sz w:val="22"/>
               </w:rPr>
-              <w:t>二、病组全景分析</w:t>
+              <w:t>三、"掌上院情" 移动决策</w:t>
             </w:r>
           </w:p>
           <w:p>
@@ -1183,7 +1402,7 @@
                 <w:b/>
                 <w:sz w:val="21"/>
               </w:rPr>
-              <w:t>1. 调研与需求分析</w:t>
+              <w:t>1. 数据应用规划设计</w:t>
             </w:r>
           </w:p>
           <w:p>
@@ -1196,7 +1415,34 @@
                 <w:rFonts w:ascii="微软雅黑" w:hAnsi="微软雅黑" w:eastAsia="微软雅黑"/>
                 <w:sz w:val="21"/>
               </w:rPr>
-              <w:t>1) 临床科室业务流程调研：针对消化内科、心内科梳理仿真数据供调研使用（继续推进）</w:t>
+              <w:t>1) 原型图内部定稿：0605 设计一版原型图初稿，用于内部讨论内部讨论（继续推进） 80%</w:t>
+            </w:r>
+          </w:p>
+          <w:p>
+            <w:pPr>
+              <w:spacing w:before="120" w:after="40" w:line="276" w:lineRule="auto"/>
+            </w:pPr>
+            <w:r>
+              <w:rPr>
+                <w:rFonts w:ascii="微软雅黑" w:hAnsi="微软雅黑" w:eastAsia="微软雅黑"/>
+                <w:b/>
+                <w:sz w:val="22"/>
+              </w:rPr>
+              <w:t>四、数据中心平台支撑（等级医院评审 + 专科服务能力指标体系）</w:t>
+            </w:r>
+          </w:p>
+          <w:p>
+            <w:pPr>
+              <w:spacing w:before="40" w:after="40" w:line="276" w:lineRule="auto"/>
+              <w:ind w:left="283"/>
+            </w:pPr>
+            <w:r>
+              <w:rPr>
+                <w:rFonts w:ascii="微软雅黑" w:hAnsi="微软雅黑" w:eastAsia="微软雅黑"/>
+                <w:b/>
+                <w:sz w:val="21"/>
+              </w:rPr>
+              <w:t>1. 平台规划与资源分配</w:t>
             </w:r>
           </w:p>
           <w:p>
@@ -1209,127 +1455,7 @@
                 <w:rFonts w:ascii="微软雅黑" w:hAnsi="微软雅黑" w:eastAsia="微软雅黑"/>
                 <w:sz w:val="21"/>
               </w:rPr>
-              <w:t>2) 梳理并确认：和消化内科确认原型（继续推进）</w:t>
-            </w:r>
-          </w:p>
-          <w:p>
-            <w:pPr>
-              <w:spacing w:before="40" w:after="40" w:line="276" w:lineRule="auto"/>
-              <w:ind w:left="283"/>
-            </w:pPr>
-            <w:r>
-              <w:rPr>
-                <w:rFonts w:ascii="微软雅黑" w:hAnsi="微软雅黑" w:eastAsia="微软雅黑"/>
-                <w:b/>
-                <w:sz w:val="21"/>
-              </w:rPr>
-              <w:t>2. 数据应用规划设计</w:t>
-            </w:r>
-          </w:p>
-          <w:p>
-            <w:pPr>
-              <w:spacing w:before="40" w:after="40" w:line="276" w:lineRule="auto"/>
-              <w:ind w:left="567"/>
-            </w:pPr>
-            <w:r>
-              <w:rPr>
-                <w:rFonts w:ascii="微软雅黑" w:hAnsi="微软雅黑" w:eastAsia="微软雅黑"/>
-                <w:sz w:val="21"/>
-              </w:rPr>
-              <w:t>1) 原型图内部定稿：21号出一版，内部讨论（继续推进）</w:t>
-            </w:r>
-          </w:p>
-          <w:p>
-            <w:pPr>
-              <w:spacing w:before="40" w:after="40" w:line="276" w:lineRule="auto"/>
-              <w:ind w:left="567"/>
-            </w:pPr>
-            <w:r>
-              <w:rPr>
-                <w:rFonts w:ascii="微软雅黑" w:hAnsi="微软雅黑" w:eastAsia="微软雅黑"/>
-                <w:sz w:val="21"/>
-              </w:rPr>
-              <w:t>2) 原型图外部评审：美化UI后发给李江了，请他发给周科（继续推进）</w:t>
-            </w:r>
-          </w:p>
-          <w:p>
-            <w:pPr>
-              <w:spacing w:before="120" w:after="40" w:line="276" w:lineRule="auto"/>
-            </w:pPr>
-            <w:r>
-              <w:rPr>
-                <w:rFonts w:ascii="微软雅黑" w:hAnsi="微软雅黑" w:eastAsia="微软雅黑"/>
-                <w:b/>
-                <w:sz w:val="22"/>
-              </w:rPr>
-              <w:t>三、"掌上院情" 移动决策</w:t>
-            </w:r>
-          </w:p>
-          <w:p>
-            <w:pPr>
-              <w:spacing w:before="40" w:after="40" w:line="276" w:lineRule="auto"/>
-              <w:ind w:left="283"/>
-            </w:pPr>
-            <w:r>
-              <w:rPr>
-                <w:rFonts w:ascii="微软雅黑" w:hAnsi="微软雅黑" w:eastAsia="微软雅黑"/>
-                <w:b/>
-                <w:sz w:val="21"/>
-              </w:rPr>
-              <w:t>1. 数据应用规划设计</w:t>
-            </w:r>
-          </w:p>
-          <w:p>
-            <w:pPr>
-              <w:spacing w:before="40" w:after="40" w:line="276" w:lineRule="auto"/>
-              <w:ind w:left="567"/>
-            </w:pPr>
-            <w:r>
-              <w:rPr>
-                <w:rFonts w:ascii="微软雅黑" w:hAnsi="微软雅黑" w:eastAsia="微软雅黑"/>
-                <w:sz w:val="21"/>
-              </w:rPr>
-              <w:t>1) 原型图内部定稿：0605 设计一版原型图初稿，用于内部讨论内部讨论（继续推进）</w:t>
-            </w:r>
-          </w:p>
-          <w:p>
-            <w:pPr>
-              <w:spacing w:before="120" w:after="40" w:line="276" w:lineRule="auto"/>
-            </w:pPr>
-            <w:r>
-              <w:rPr>
-                <w:rFonts w:ascii="微软雅黑" w:hAnsi="微软雅黑" w:eastAsia="微软雅黑"/>
-                <w:b/>
-                <w:sz w:val="22"/>
-              </w:rPr>
-              <w:t>四、数据中心平台支撑（等级医院评审 + 专科服务能力指标体系）</w:t>
-            </w:r>
-          </w:p>
-          <w:p>
-            <w:pPr>
-              <w:spacing w:before="40" w:after="40" w:line="276" w:lineRule="auto"/>
-              <w:ind w:left="283"/>
-            </w:pPr>
-            <w:r>
-              <w:rPr>
-                <w:rFonts w:ascii="微软雅黑" w:hAnsi="微软雅黑" w:eastAsia="微软雅黑"/>
-                <w:b/>
-                <w:sz w:val="21"/>
-              </w:rPr>
-              <w:t>1. 平台规划与资源分配</w:t>
-            </w:r>
-          </w:p>
-          <w:p>
-            <w:pPr>
-              <w:spacing w:before="40" w:after="40" w:line="276" w:lineRule="auto"/>
-              <w:ind w:left="567"/>
-            </w:pPr>
-            <w:r>
-              <w:rPr>
-                <w:rFonts w:ascii="微软雅黑" w:hAnsi="微软雅黑" w:eastAsia="微软雅黑"/>
-                <w:sz w:val="21"/>
-              </w:rPr>
-              <w:t>1) 规划数据中台资源分配方案（用户权限、存储、计算资源）：已提供单独端口，待继续验证（继续推进）</w:t>
+              <w:t>1) 规划数据中台资源分配方案（用户权限、存储、计算资源）：已提供单独端口，待继续验证（继续推进） 35%</w:t>
             </w:r>
           </w:p>
         </w:tc>
@@ -1377,16 +1503,13 @@
             <w:gridSpan w:val="4"/>
           </w:tcPr>
           <w:p>
-            <w:pPr>
-              <w:spacing w:before="40" w:after="40"/>
-            </w:pPr>
             <w:r/>
             <w:r>
               <w:rPr>
                 <w:rFonts w:ascii="微软雅黑" w:hAnsi="微软雅黑" w:eastAsia="微软雅黑"/>
                 <w:sz w:val="21"/>
               </w:rPr>
-              <w:t>1) 医共体运营管理驾驶舱 - Smartbi前端可视化大屏与地图组件开发：卫宁数据开发尚未完成，需要提供数据字典给smartbi（当前进度 8%）</w:t>
+              <w:t>暂无。</w:t>
             </w:r>
           </w:p>
         </w:tc>

</xml_diff>